<commit_message>
Resolve PEAK loan summary discrepancies per PM confirmation
- $280,000 confirmed as authoritative; concept note's $300,000
  header noted as a source-document error rather than left open.
- Reach-projection question resolved: previous facility's actual
  loan-attributable reach was ~22,000 (not the 38,305 total-clients
  figure), and the ~30,000 target reflects real growth adjusted for
  naira depreciation since 2024.
- Both items converted from red open-flags to settled text, and the
  Q&A table now carries real answers instead of "TO CONFIRM".

Co-Authored-By: Claude Sonnet 5 <noreply@anthropic.com>
Claude-Session: https://claude.ai/code/session_0187mhodj5WQ6B8rLfzDmXmy
</commit_message>
<xml_diff>
--- a/deliverables/PEAK_Loan_Application_Summary.docx
+++ b/deliverables/PEAK_Loan_Application_Summary.docx
@@ -279,24 +279,6 @@
     </w:p>
     <w:p>
       <w:pPr>
-        <w:spacing w:after="160" w:before="0"/>
-      </w:pPr>
-      <w:r>
-        <w:rPr>
-          <w:rFonts w:ascii="Calibri" w:cs="Calibri" w:eastAsia="Calibri" w:hAnsi="Calibri"/>
-          <w:b w:val="false"/>
-          <w:bCs w:val="false"/>
-          <w:i/>
-          <w:iCs/>
-          <w:color w:val="FF0000"/>
-          <w:sz w:val="22"/>
-          <w:szCs w:val="22"/>
-        </w:rPr>
-        <w:t xml:space="preserve">Note: PEAK’s 2026 concept note states US$300,000 in its header but US$280,000 in both its “Proposed New Facility” and “Conclusion” sections — confirm the authoritative figure before this application proceeds.</w:t>
-      </w:r>
-    </w:p>
-    <w:p>
-      <w:pPr>
         <w:pStyle w:val="Heading1"/>
         <w:spacing w:after="160" w:before="320"/>
       </w:pPr>
@@ -750,13 +732,13 @@
           <w:rFonts w:ascii="Calibri" w:cs="Calibri" w:eastAsia="Calibri" w:hAnsi="Calibri"/>
           <w:b w:val="false"/>
           <w:bCs w:val="false"/>
-          <w:i w:val="false"/>
-          <w:iCs w:val="false"/>
-          <w:color w:val="FF0000"/>
-          <w:sz w:val="22"/>
-          <w:szCs w:val="22"/>
-        </w:rPr>
-        <w:t xml:space="preserve">  [PEAK’s concept note header states US$300,000 — confirm authoritative figure]</w:t>
+          <w:i/>
+          <w:iCs/>
+          <w:color w:val="000000"/>
+          <w:sz w:val="22"/>
+          <w:szCs w:val="22"/>
+        </w:rPr>
+        <w:t xml:space="preserve"> (confirmed; the concept note’s header figure of US$300,000 is an error in that source document).</w:t>
       </w:r>
     </w:p>
     <w:p>
@@ -1049,33 +1031,7 @@
           <w:sz w:val="22"/>
           <w:szCs w:val="22"/>
         </w:rPr>
-        <w:t xml:space="preserve">Building on this foundation, the proposed US$280,000 </w:t>
-      </w:r>
-      <w:r>
-        <w:rPr>
-          <w:rFonts w:ascii="Calibri" w:cs="Calibri" w:eastAsia="Calibri" w:hAnsi="Calibri"/>
-          <w:b w:val="false"/>
-          <w:bCs w:val="false"/>
-          <w:i w:val="false"/>
-          <w:iCs w:val="false"/>
-          <w:color w:val="FF0000"/>
-          <w:sz w:val="22"/>
-          <w:szCs w:val="22"/>
-        </w:rPr>
-        <w:t xml:space="preserve">[confirm vs. US$300,000 stated in the concept note’s header]</w:t>
-      </w:r>
-      <w:r>
-        <w:rPr>
-          <w:rFonts w:ascii="Calibri" w:cs="Calibri" w:eastAsia="Calibri" w:hAnsi="Calibri"/>
-          <w:b w:val="false"/>
-          <w:bCs w:val="false"/>
-          <w:i w:val="false"/>
-          <w:iCs w:val="false"/>
-          <w:color w:val="000000"/>
-          <w:sz w:val="22"/>
-          <w:szCs w:val="22"/>
-        </w:rPr>
-        <w:t xml:space="preserve"> follow-on facility would be used to: expand lending to micro and small businesses; provide working capital to existing and new enterprises; increase financing for women-owned businesses and youth entrepreneurs; support rural traders and productive enterprises; and extend financial services to additional underserved communities and MSMEs.</w:t>
+        <w:t xml:space="preserve">Building on this foundation, the proposed US$280,000 follow-on facility would be used to: expand lending to micro and small businesses; provide working capital to existing and new enterprises; increase financing for women-owned businesses and youth entrepreneurs; support rural traders and productive enterprises; and extend financial services to additional underserved communities and MSMEs.</w:t>
       </w:r>
     </w:p>
     <w:p>
@@ -1105,13 +1061,13 @@
           <w:rFonts w:ascii="Calibri" w:cs="Calibri" w:eastAsia="Calibri" w:hAnsi="Calibri"/>
           <w:b w:val="false"/>
           <w:bCs w:val="false"/>
-          <w:i/>
-          <w:iCs/>
-          <w:color w:val="FF0000"/>
-          <w:sz w:val="22"/>
-          <w:szCs w:val="22"/>
-        </w:rPr>
-        <w:t xml:space="preserve">Note for the PM: this projected reach of ~30,000 is lower than the 38,305 clients actually reached under the previous, smaller US$100,000 facility — worth clarifying with PEAK whether this reflects a more conservative methodology, a shift toward larger average loan sizes, or another factor, ahead of the committee meeting.</w:t>
+          <w:i w:val="false"/>
+          <w:iCs w:val="false"/>
+          <w:color w:val="000000"/>
+          <w:sz w:val="22"/>
+          <w:szCs w:val="22"/>
+        </w:rPr>
+        <w:t xml:space="preserve">This represents real growth over the previous facility’s actual loan-attributable reach of approximately 22,000 (as distinct from the 38,305 total-clients figure cited in the Historic Financial Performance section below, which spans PEAK’s broader client base). The increase is more modest in percentage terms than the facility’s size increase alone would suggest, because the naira has depreciated significantly since 2024: in a tougher economic climate, beneficiaries need larger loan sizes to meet their needs, which reduces the number reached per dollar of capital relative to 2024 conditions.</w:t>
       </w:r>
     </w:p>
     <w:p>
@@ -2501,11 +2457,11 @@
           <w:bCs w:val="false"/>
           <w:i/>
           <w:iCs/>
-          <w:color w:val="FF0000"/>
-          <w:sz w:val="22"/>
-          <w:szCs w:val="22"/>
-        </w:rPr>
-        <w:t xml:space="preserve">Note: this projected reach of ~30,000 individuals/businesses is lower than the 38,305 clients actually reached under the smaller, previous US$100,000 facility — worth clarifying with PEAK ahead of the committee meeting.</w:t>
+          <w:color w:val="000000"/>
+          <w:sz w:val="22"/>
+          <w:szCs w:val="22"/>
+        </w:rPr>
+        <w:t xml:space="preserve">See Use of the Funds &amp; Social Impact above: this ~30,000 target represents real growth over the previous facility’s actual loan-attributable reach of ~22,000, adjusted for the naira’s depreciation since 2024 and the correspondingly larger loan sizes beneficiaries now need.</w:t>
       </w:r>
     </w:p>
     <w:p>
@@ -2959,7 +2915,7 @@
                 <w:sz w:val="22"/>
                 <w:szCs w:val="22"/>
               </w:rPr>
-              <w:t xml:space="preserve">Facility is USD-denominated while on-lending activity and borrower repayments are in Naira, exposing the facility to currency and inflation risk.</w:t>
+              <w:t xml:space="preserve">Facility is USD-denominated while on-lending activity and borrower repayments are in Naira, exposing the facility to currency and inflation risk. This is already visible in PEAK’s own projections: the naira’s depreciation since 2024 means beneficiaries need larger loan sizes, reducing projected reach per dollar of capital relative to the previous facility.</w:t>
             </w:r>
           </w:p>
         </w:tc>
@@ -4322,7 +4278,7 @@
           <w:sz w:val="22"/>
           <w:szCs w:val="22"/>
         </w:rPr>
-        <w:t xml:space="preserve">No questions have yet been raised by the Staff Capital Committee. Based on the source materials reviewed for this application, the PM may wish to prepare responses to the following anticipated questions in advance:</w:t>
+        <w:t xml:space="preserve">No questions have yet been raised by the Staff Capital Committee. Based on the source materials reviewed for this application, the PM has pre-empted two likely questions below; further committee questions will be added as they arise.</w:t>
       </w:r>
     </w:p>
     <w:tbl>
@@ -4484,7 +4440,7 @@
                 <w:sz w:val="22"/>
                 <w:szCs w:val="22"/>
               </w:rPr>
-              <w:t xml:space="preserve">[TO CONFIRM WITH PEAK]</w:t>
+              <w:t xml:space="preserve">US$280,000 is the confirmed, authoritative figure. The concept note’s header figure of US$300,000 is an error in that source document.</w:t>
             </w:r>
           </w:p>
         </w:tc>
@@ -4526,7 +4482,7 @@
                 <w:sz w:val="22"/>
                 <w:szCs w:val="22"/>
               </w:rPr>
-              <w:t xml:space="preserve">The proposed facility projects reaching ~30,000 individuals/businesses, fewer than the 38,305 clients actually reached under the smaller, previous US$100,000 facility — why is the projected reach lower despite the larger facility size?</w:t>
+              <w:t xml:space="preserve">The proposed facility projects reaching ~30,000 individuals/businesses — why does this look low relative to the previous facility’s cited 38,305 clients reached, for a facility 2.8x the size?</w:t>
             </w:r>
           </w:p>
         </w:tc>
@@ -4562,7 +4518,7 @@
                 <w:sz w:val="22"/>
                 <w:szCs w:val="22"/>
               </w:rPr>
-              <w:t xml:space="preserve">[TO CONFIRM WITH PEAK]</w:t>
+              <w:t xml:space="preserve">The 38,305 figure spans PEAK’s broader client base; the previous facility’s actual loan-attributable reach was approximately 22,000. The ~30,000 projection is real growth over that base, adjusted for the naira’s depreciation since 2024 — tougher economic conditions mean beneficiaries now need larger loan sizes, which reduces the number reached per dollar of capital.</w:t>
             </w:r>
           </w:p>
         </w:tc>

</xml_diff>